<commit_message>
Updated documentation page to include NFSM using Thompson and DFSM conversion
</commit_message>
<xml_diff>
--- a/Documentation_Template.docx
+++ b/Documentation_Template.docx
@@ -74,7 +74,25 @@
           <w:sz w:val="28"/>
           <w:szCs w:val="28"/>
         </w:rPr>
-        <w:t xml:space="preserve">from Rat26S code. The lexer is given these characters, strings, and integers from a main file and generates appropriate tokens to match with their correct lexeme. We approach this problem through using </w:t>
+        <w:t xml:space="preserve">from Rat26S code. The </w:t>
+      </w:r>
+      <w:proofErr w:type="spellStart"/>
+      <w:r>
+        <w:rPr>
+          <w:iCs/>
+          <w:sz w:val="28"/>
+          <w:szCs w:val="28"/>
+        </w:rPr>
+        <w:t>lexer</w:t>
+      </w:r>
+      <w:proofErr w:type="spellEnd"/>
+      <w:r>
+        <w:rPr>
+          <w:iCs/>
+          <w:sz w:val="28"/>
+          <w:szCs w:val="28"/>
+        </w:rPr>
+        <w:t xml:space="preserve"> is given these characters, strings, and integers from a main file and generates appropriate tokens to match with their correct lexeme. We approach this problem through using </w:t>
       </w:r>
       <w:r>
         <w:rPr>
@@ -606,7 +624,23 @@
           <w:sz w:val="28"/>
           <w:szCs w:val="28"/>
         </w:rPr>
-        <w:t>The classify() function creates a new FSM instance for each lexeme and processes characters sequentially using the transition table. After all characters are evaluated, the final state is checked against predefined accepting states to determine the token type. If the FSM reaches an invalid transition, the lexeme is classified as "Unknown".</w:t>
+        <w:t xml:space="preserve">The </w:t>
+      </w:r>
+      <w:proofErr w:type="gramStart"/>
+      <w:r>
+        <w:rPr>
+          <w:sz w:val="28"/>
+          <w:szCs w:val="28"/>
+        </w:rPr>
+        <w:t>classify(</w:t>
+      </w:r>
+      <w:proofErr w:type="gramEnd"/>
+      <w:r>
+        <w:rPr>
+          <w:sz w:val="28"/>
+          <w:szCs w:val="28"/>
+        </w:rPr>
+        <w:t>) function creates a new FSM instance for each lexeme and processes characters sequentially using the transition table. After all characters are evaluated, the final state is checked against predefined accepting states to determine the token type. If the FSM reaches an invalid transition, the lexeme is classified as "Unknown".</w:t>
       </w:r>
     </w:p>
     <w:p>
@@ -643,6 +677,2335 @@
           <w:szCs w:val="28"/>
           <w:u w:val="single"/>
         </w:rPr>
+        <w:t>NFSM via Thompson's Construction</w:t>
+      </w:r>
+      <w:r>
+        <w:rPr>
+          <w:b/>
+          <w:bCs/>
+          <w:sz w:val="28"/>
+          <w:szCs w:val="28"/>
+          <w:u w:val="single"/>
+        </w:rPr>
+        <w:t>:</w:t>
+      </w:r>
+      <w:r>
+        <w:rPr>
+          <w:sz w:val="28"/>
+          <w:szCs w:val="28"/>
+        </w:rPr>
+        <w:t xml:space="preserve"> </w:t>
+      </w:r>
+      <w:r>
+        <w:rPr>
+          <w:sz w:val="28"/>
+          <w:szCs w:val="28"/>
+        </w:rPr>
+        <w:t>Thompson's Construction converts each regular expression into a Non-deterministic Finite State Machine (NFSM) by breaking the expression into primitive operations and connecting them with ε-transitions (free transitions that consume no input).</w:t>
+      </w:r>
+    </w:p>
+    <w:p>
+      <w:pPr>
+        <w:pStyle w:val="NormalWeb"/>
+        <w:ind w:left="720"/>
+        <w:rPr>
+          <w:sz w:val="28"/>
+          <w:szCs w:val="28"/>
+        </w:rPr>
+      </w:pPr>
+      <w:r>
+        <w:rPr>
+          <w:sz w:val="28"/>
+          <w:szCs w:val="28"/>
+        </w:rPr>
+        <w:t>Integer</w:t>
+      </w:r>
+      <w:r>
+        <w:rPr>
+          <w:sz w:val="28"/>
+          <w:szCs w:val="28"/>
+        </w:rPr>
+        <w:t xml:space="preserve">: </w:t>
+      </w:r>
+      <w:r>
+        <w:rPr>
+          <w:sz w:val="28"/>
+          <w:szCs w:val="28"/>
+        </w:rPr>
+        <w:t>[0-</w:t>
+      </w:r>
+      <w:proofErr w:type="gramStart"/>
+      <w:r>
+        <w:rPr>
+          <w:sz w:val="28"/>
+          <w:szCs w:val="28"/>
+        </w:rPr>
+        <w:t>9]+</w:t>
+      </w:r>
+      <w:proofErr w:type="gramEnd"/>
+    </w:p>
+    <w:p>
+      <w:pPr>
+        <w:pStyle w:val="NormalWeb"/>
+        <w:ind w:left="720" w:firstLine="940"/>
+        <w:rPr>
+          <w:sz w:val="28"/>
+          <w:szCs w:val="28"/>
+        </w:rPr>
+      </w:pPr>
+      <w:r>
+        <w:rPr>
+          <w:sz w:val="28"/>
+          <w:szCs w:val="28"/>
+        </w:rPr>
+        <w:t xml:space="preserve">digit             </w:t>
+      </w:r>
+      <w:r>
+        <w:rPr>
+          <w:sz w:val="28"/>
+          <w:szCs w:val="28"/>
+        </w:rPr>
+        <w:tab/>
+      </w:r>
+      <w:r>
+        <w:rPr>
+          <w:sz w:val="28"/>
+          <w:szCs w:val="28"/>
+        </w:rPr>
+        <w:tab/>
+        <w:t xml:space="preserve">ε        </w:t>
+      </w:r>
+      <w:r>
+        <w:rPr>
+          <w:sz w:val="28"/>
+          <w:szCs w:val="28"/>
+        </w:rPr>
+        <w:tab/>
+      </w:r>
+      <w:r>
+        <w:rPr>
+          <w:sz w:val="28"/>
+          <w:szCs w:val="28"/>
+        </w:rPr>
+        <w:tab/>
+      </w:r>
+      <w:r>
+        <w:rPr>
+          <w:sz w:val="28"/>
+          <w:szCs w:val="28"/>
+        </w:rPr>
+        <w:tab/>
+        <w:t xml:space="preserve">   digit</w:t>
+      </w:r>
+      <w:r>
+        <w:rPr>
+          <w:sz w:val="28"/>
+          <w:szCs w:val="28"/>
+        </w:rPr>
+        <w:br/>
+      </w:r>
+      <w:r>
+        <w:rPr>
+          <w:sz w:val="28"/>
+          <w:szCs w:val="28"/>
+        </w:rPr>
+        <w:sym w:font="Wingdings" w:char="F0E0"/>
+      </w:r>
+      <w:r>
+        <w:rPr>
+          <w:sz w:val="28"/>
+          <w:szCs w:val="28"/>
+        </w:rPr>
+        <w:t xml:space="preserve"> </w:t>
+      </w:r>
+      <w:r>
+        <w:rPr>
+          <w:sz w:val="28"/>
+          <w:szCs w:val="28"/>
+        </w:rPr>
+        <w:t xml:space="preserve">q0 </w:t>
+      </w:r>
+      <w:r>
+        <w:rPr>
+          <w:rFonts w:hint="eastAsia"/>
+          <w:sz w:val="28"/>
+          <w:szCs w:val="28"/>
+        </w:rPr>
+        <w:t>──────</w:t>
+      </w:r>
+      <w:r>
+        <w:rPr>
+          <w:sz w:val="28"/>
+          <w:szCs w:val="28"/>
+        </w:rPr>
+        <w:t xml:space="preserve">► q1 (acc) </w:t>
+      </w:r>
+      <w:r>
+        <w:rPr>
+          <w:rFonts w:hint="eastAsia"/>
+          <w:sz w:val="28"/>
+          <w:szCs w:val="28"/>
+        </w:rPr>
+        <w:t>──────</w:t>
+      </w:r>
+      <w:r>
+        <w:rPr>
+          <w:sz w:val="28"/>
+          <w:szCs w:val="28"/>
+        </w:rPr>
+        <w:t xml:space="preserve">► q2 </w:t>
+      </w:r>
+      <w:r>
+        <w:rPr>
+          <w:rFonts w:hint="eastAsia"/>
+          <w:sz w:val="28"/>
+          <w:szCs w:val="28"/>
+        </w:rPr>
+        <w:t>──────────</w:t>
+      </w:r>
+      <w:r>
+        <w:rPr>
+          <w:sz w:val="28"/>
+          <w:szCs w:val="28"/>
+        </w:rPr>
+        <w:t>► q3</w:t>
+      </w:r>
+    </w:p>
+    <w:p>
+      <w:pPr>
+        <w:pStyle w:val="NormalWeb"/>
+        <w:ind w:left="720"/>
+        <w:rPr>
+          <w:sz w:val="28"/>
+          <w:szCs w:val="28"/>
+        </w:rPr>
+      </w:pPr>
+      <w:r>
+        <w:rPr>
+          <w:sz w:val="28"/>
+          <w:szCs w:val="28"/>
+        </w:rPr>
+        <w:t xml:space="preserve">                     </w:t>
+      </w:r>
+      <w:r>
+        <w:rPr>
+          <w:sz w:val="28"/>
+          <w:szCs w:val="28"/>
+        </w:rPr>
+        <w:tab/>
+      </w:r>
+      <w:r>
+        <w:rPr>
+          <w:sz w:val="28"/>
+          <w:szCs w:val="28"/>
+        </w:rPr>
+        <w:tab/>
+      </w:r>
+      <w:r>
+        <w:rPr>
+          <w:sz w:val="28"/>
+          <w:szCs w:val="28"/>
+        </w:rPr>
+        <w:tab/>
+      </w:r>
+      <w:r>
+        <w:rPr>
+          <w:sz w:val="28"/>
+          <w:szCs w:val="28"/>
+        </w:rPr>
+        <w:t xml:space="preserve">     </w:t>
+      </w:r>
+      <w:r>
+        <w:rPr>
+          <w:sz w:val="28"/>
+          <w:szCs w:val="28"/>
+        </w:rPr>
+        <w:tab/>
+      </w:r>
+      <w:r>
+        <w:rPr>
+          <w:sz w:val="28"/>
+          <w:szCs w:val="28"/>
+        </w:rPr>
+        <w:tab/>
+      </w:r>
+      <w:r>
+        <w:rPr>
+          <w:sz w:val="28"/>
+          <w:szCs w:val="28"/>
+        </w:rPr>
+        <w:t>◄</w:t>
+      </w:r>
+      <w:r>
+        <w:rPr>
+          <w:rFonts w:hint="eastAsia"/>
+          <w:sz w:val="28"/>
+          <w:szCs w:val="28"/>
+        </w:rPr>
+        <w:t>────────────</w:t>
+      </w:r>
+    </w:p>
+    <w:p>
+      <w:pPr>
+        <w:pStyle w:val="NormalWeb"/>
+        <w:ind w:left="720"/>
+        <w:rPr>
+          <w:sz w:val="28"/>
+          <w:szCs w:val="28"/>
+        </w:rPr>
+      </w:pPr>
+      <w:r>
+        <w:rPr>
+          <w:sz w:val="28"/>
+          <w:szCs w:val="28"/>
+        </w:rPr>
+        <w:t xml:space="preserve">                              </w:t>
+      </w:r>
+      <w:r>
+        <w:rPr>
+          <w:sz w:val="28"/>
+          <w:szCs w:val="28"/>
+        </w:rPr>
+        <w:tab/>
+      </w:r>
+      <w:r>
+        <w:rPr>
+          <w:sz w:val="28"/>
+          <w:szCs w:val="28"/>
+        </w:rPr>
+        <w:tab/>
+      </w:r>
+      <w:r>
+        <w:rPr>
+          <w:sz w:val="28"/>
+          <w:szCs w:val="28"/>
+        </w:rPr>
+        <w:tab/>
+      </w:r>
+      <w:r>
+        <w:rPr>
+          <w:sz w:val="28"/>
+          <w:szCs w:val="28"/>
+        </w:rPr>
+        <w:tab/>
+      </w:r>
+      <w:r>
+        <w:rPr>
+          <w:sz w:val="28"/>
+          <w:szCs w:val="28"/>
+        </w:rPr>
+        <w:tab/>
+      </w:r>
+      <w:r>
+        <w:rPr>
+          <w:sz w:val="28"/>
+          <w:szCs w:val="28"/>
+        </w:rPr>
+        <w:tab/>
+      </w:r>
+      <w:r>
+        <w:rPr>
+          <w:sz w:val="28"/>
+          <w:szCs w:val="28"/>
+        </w:rPr>
+        <w:t xml:space="preserve">  ε (loop)</w:t>
+      </w:r>
+    </w:p>
+    <w:p>
+      <w:pPr>
+        <w:pStyle w:val="NormalWeb"/>
+        <w:ind w:left="720"/>
+        <w:rPr>
+          <w:sz w:val="28"/>
+          <w:szCs w:val="28"/>
+        </w:rPr>
+      </w:pPr>
+      <w:r>
+        <w:rPr>
+          <w:sz w:val="28"/>
+          <w:szCs w:val="28"/>
+        </w:rPr>
+        <w:lastRenderedPageBreak/>
+        <w:t>Real</w:t>
+      </w:r>
+      <w:r>
+        <w:rPr>
+          <w:sz w:val="28"/>
+          <w:szCs w:val="28"/>
+        </w:rPr>
+        <w:t xml:space="preserve">: </w:t>
+      </w:r>
+      <w:r>
+        <w:rPr>
+          <w:sz w:val="28"/>
+          <w:szCs w:val="28"/>
+        </w:rPr>
+        <w:t>[0-</w:t>
+      </w:r>
+      <w:proofErr w:type="gramStart"/>
+      <w:r>
+        <w:rPr>
+          <w:sz w:val="28"/>
+          <w:szCs w:val="28"/>
+        </w:rPr>
+        <w:t>9]+</w:t>
+      </w:r>
+      <w:proofErr w:type="gramEnd"/>
+      <w:r>
+        <w:rPr>
+          <w:sz w:val="28"/>
+          <w:szCs w:val="28"/>
+        </w:rPr>
+        <w:t xml:space="preserve"> </w:t>
+      </w:r>
+      <w:r>
+        <w:rPr>
+          <w:sz w:val="28"/>
+          <w:szCs w:val="28"/>
+        </w:rPr>
+        <w:t>.</w:t>
+      </w:r>
+      <w:r>
+        <w:rPr>
+          <w:sz w:val="28"/>
+          <w:szCs w:val="28"/>
+        </w:rPr>
+        <w:t xml:space="preserve"> </w:t>
+      </w:r>
+      <w:r>
+        <w:rPr>
+          <w:sz w:val="28"/>
+          <w:szCs w:val="28"/>
+        </w:rPr>
+        <w:t>[0-</w:t>
+      </w:r>
+      <w:proofErr w:type="gramStart"/>
+      <w:r>
+        <w:rPr>
+          <w:sz w:val="28"/>
+          <w:szCs w:val="28"/>
+        </w:rPr>
+        <w:t>9]+</w:t>
+      </w:r>
+      <w:proofErr w:type="gramEnd"/>
+    </w:p>
+    <w:p>
+      <w:pPr>
+        <w:pStyle w:val="NormalWeb"/>
+        <w:ind w:firstLine="720"/>
+        <w:rPr>
+          <w:sz w:val="28"/>
+          <w:szCs w:val="28"/>
+        </w:rPr>
+      </w:pPr>
+      <w:r>
+        <w:rPr>
+          <w:sz w:val="28"/>
+          <w:szCs w:val="28"/>
+        </w:rPr>
+        <w:t xml:space="preserve"> digit      </w:t>
+      </w:r>
+      <w:r>
+        <w:rPr>
+          <w:sz w:val="28"/>
+          <w:szCs w:val="28"/>
+        </w:rPr>
+        <w:t xml:space="preserve">   </w:t>
+      </w:r>
+      <w:r>
+        <w:rPr>
+          <w:sz w:val="28"/>
+          <w:szCs w:val="28"/>
+        </w:rPr>
+        <w:t>ε</w:t>
+      </w:r>
+      <w:r>
+        <w:rPr>
+          <w:sz w:val="28"/>
+          <w:szCs w:val="28"/>
+        </w:rPr>
+        <w:t xml:space="preserve">    </w:t>
+      </w:r>
+      <w:r>
+        <w:rPr>
+          <w:sz w:val="28"/>
+          <w:szCs w:val="28"/>
+        </w:rPr>
+        <w:t xml:space="preserve"> </w:t>
+      </w:r>
+      <w:r>
+        <w:rPr>
+          <w:sz w:val="28"/>
+          <w:szCs w:val="28"/>
+        </w:rPr>
+        <w:t>digi</w:t>
+      </w:r>
+      <w:r>
+        <w:rPr>
+          <w:sz w:val="28"/>
+          <w:szCs w:val="28"/>
+        </w:rPr>
+        <w:t xml:space="preserve">t   </w:t>
+      </w:r>
+      <w:r>
+        <w:rPr>
+          <w:sz w:val="28"/>
+          <w:szCs w:val="28"/>
+        </w:rPr>
+        <w:t xml:space="preserve">  </w:t>
+      </w:r>
+      <w:r>
+        <w:rPr>
+          <w:sz w:val="28"/>
+          <w:szCs w:val="28"/>
+        </w:rPr>
+        <w:t xml:space="preserve">ε       </w:t>
+      </w:r>
+      <w:r>
+        <w:rPr>
+          <w:sz w:val="28"/>
+          <w:szCs w:val="28"/>
+        </w:rPr>
+        <w:t xml:space="preserve"> </w:t>
+      </w:r>
+      <w:r>
+        <w:rPr>
+          <w:sz w:val="28"/>
+          <w:szCs w:val="28"/>
+        </w:rPr>
+        <w:t xml:space="preserve"> </w:t>
+      </w:r>
+      <w:proofErr w:type="gramStart"/>
+      <w:r>
+        <w:rPr>
+          <w:sz w:val="28"/>
+          <w:szCs w:val="28"/>
+        </w:rPr>
+        <w:t xml:space="preserve">  </w:t>
+      </w:r>
+      <w:r>
+        <w:rPr>
+          <w:sz w:val="28"/>
+          <w:szCs w:val="28"/>
+        </w:rPr>
+        <w:t>.</w:t>
+      </w:r>
+      <w:proofErr w:type="gramEnd"/>
+      <w:r>
+        <w:rPr>
+          <w:sz w:val="28"/>
+          <w:szCs w:val="28"/>
+        </w:rPr>
+        <w:t xml:space="preserve">        </w:t>
+      </w:r>
+      <w:r>
+        <w:rPr>
+          <w:sz w:val="28"/>
+          <w:szCs w:val="28"/>
+        </w:rPr>
+        <w:t xml:space="preserve"> </w:t>
+      </w:r>
+      <w:r>
+        <w:rPr>
+          <w:sz w:val="28"/>
+          <w:szCs w:val="28"/>
+        </w:rPr>
+        <w:t xml:space="preserve">ε    digit   ε    </w:t>
+      </w:r>
+      <w:r>
+        <w:rPr>
+          <w:sz w:val="28"/>
+          <w:szCs w:val="28"/>
+        </w:rPr>
+        <w:t xml:space="preserve">     </w:t>
+      </w:r>
+      <w:r>
+        <w:rPr>
+          <w:sz w:val="28"/>
+          <w:szCs w:val="28"/>
+        </w:rPr>
+        <w:t>digit</w:t>
+      </w:r>
+      <w:r>
+        <w:rPr>
+          <w:sz w:val="28"/>
+          <w:szCs w:val="28"/>
+        </w:rPr>
+        <w:br/>
+      </w:r>
+      <w:r>
+        <w:rPr>
+          <w:sz w:val="28"/>
+          <w:szCs w:val="28"/>
+        </w:rPr>
+        <w:sym w:font="Wingdings" w:char="F0E0"/>
+      </w:r>
+      <w:r>
+        <w:rPr>
+          <w:sz w:val="28"/>
+          <w:szCs w:val="28"/>
+        </w:rPr>
+        <w:t xml:space="preserve"> </w:t>
+      </w:r>
+      <w:r>
+        <w:rPr>
+          <w:sz w:val="28"/>
+          <w:szCs w:val="28"/>
+        </w:rPr>
+        <w:t xml:space="preserve">q0 </w:t>
+      </w:r>
+      <w:r>
+        <w:rPr>
+          <w:rFonts w:hint="eastAsia"/>
+          <w:sz w:val="28"/>
+          <w:szCs w:val="28"/>
+        </w:rPr>
+        <w:t>──</w:t>
+      </w:r>
+      <w:r>
+        <w:rPr>
+          <w:sz w:val="28"/>
+          <w:szCs w:val="28"/>
+        </w:rPr>
+        <w:t xml:space="preserve">► q1 </w:t>
+      </w:r>
+      <w:r>
+        <w:rPr>
+          <w:rFonts w:hint="eastAsia"/>
+          <w:sz w:val="28"/>
+          <w:szCs w:val="28"/>
+        </w:rPr>
+        <w:t>──</w:t>
+      </w:r>
+      <w:r>
+        <w:rPr>
+          <w:sz w:val="28"/>
+          <w:szCs w:val="28"/>
+        </w:rPr>
+        <w:t xml:space="preserve">► q2 </w:t>
+      </w:r>
+      <w:r>
+        <w:rPr>
+          <w:rFonts w:hint="eastAsia"/>
+          <w:sz w:val="28"/>
+          <w:szCs w:val="28"/>
+        </w:rPr>
+        <w:t>──</w:t>
+      </w:r>
+      <w:r>
+        <w:rPr>
+          <w:sz w:val="28"/>
+          <w:szCs w:val="28"/>
+        </w:rPr>
+        <w:t xml:space="preserve">► q3 </w:t>
+      </w:r>
+      <w:r>
+        <w:rPr>
+          <w:rFonts w:hint="eastAsia"/>
+          <w:sz w:val="28"/>
+          <w:szCs w:val="28"/>
+        </w:rPr>
+        <w:t>──</w:t>
+      </w:r>
+      <w:r>
+        <w:rPr>
+          <w:sz w:val="28"/>
+          <w:szCs w:val="28"/>
+        </w:rPr>
+        <w:t xml:space="preserve">► q4 </w:t>
+      </w:r>
+      <w:r>
+        <w:rPr>
+          <w:rFonts w:hint="eastAsia"/>
+          <w:sz w:val="28"/>
+          <w:szCs w:val="28"/>
+        </w:rPr>
+        <w:t>──</w:t>
+      </w:r>
+      <w:r>
+        <w:rPr>
+          <w:sz w:val="28"/>
+          <w:szCs w:val="28"/>
+        </w:rPr>
+        <w:t xml:space="preserve">► q5 </w:t>
+      </w:r>
+      <w:r>
+        <w:rPr>
+          <w:rFonts w:hint="eastAsia"/>
+          <w:sz w:val="28"/>
+          <w:szCs w:val="28"/>
+        </w:rPr>
+        <w:t>──</w:t>
+      </w:r>
+      <w:r>
+        <w:rPr>
+          <w:sz w:val="28"/>
+          <w:szCs w:val="28"/>
+        </w:rPr>
+        <w:t xml:space="preserve">► q6 </w:t>
+      </w:r>
+      <w:r>
+        <w:rPr>
+          <w:rFonts w:hint="eastAsia"/>
+          <w:sz w:val="28"/>
+          <w:szCs w:val="28"/>
+        </w:rPr>
+        <w:t>──</w:t>
+      </w:r>
+      <w:r>
+        <w:rPr>
+          <w:sz w:val="28"/>
+          <w:szCs w:val="28"/>
+        </w:rPr>
+        <w:t>► q</w:t>
+      </w:r>
+      <w:r>
+        <w:rPr>
+          <w:sz w:val="28"/>
+          <w:szCs w:val="28"/>
+        </w:rPr>
+        <w:t>7</w:t>
+      </w:r>
+    </w:p>
+    <w:p>
+      <w:pPr>
+        <w:pStyle w:val="NormalWeb"/>
+        <w:ind w:left="720"/>
+        <w:rPr>
+          <w:sz w:val="28"/>
+          <w:szCs w:val="28"/>
+        </w:rPr>
+      </w:pPr>
+      <w:r>
+        <w:rPr>
+          <w:sz w:val="28"/>
+          <w:szCs w:val="28"/>
+        </w:rPr>
+        <w:t xml:space="preserve">           </w:t>
+      </w:r>
+      <w:r>
+        <w:rPr>
+          <w:sz w:val="28"/>
+          <w:szCs w:val="28"/>
+        </w:rPr>
+        <w:t xml:space="preserve">  </w:t>
+      </w:r>
+      <w:r>
+        <w:rPr>
+          <w:sz w:val="28"/>
+          <w:szCs w:val="28"/>
+        </w:rPr>
+        <w:t>◄</w:t>
+      </w:r>
+      <w:r>
+        <w:rPr>
+          <w:rFonts w:hint="eastAsia"/>
+          <w:sz w:val="28"/>
+          <w:szCs w:val="28"/>
+        </w:rPr>
+        <w:t>───</w:t>
+      </w:r>
+      <w:r>
+        <w:rPr>
+          <w:sz w:val="28"/>
+          <w:szCs w:val="28"/>
+        </w:rPr>
+        <w:t xml:space="preserve">                                             </w:t>
+      </w:r>
+      <w:r>
+        <w:rPr>
+          <w:sz w:val="28"/>
+          <w:szCs w:val="28"/>
+        </w:rPr>
+        <w:tab/>
+      </w:r>
+      <w:r>
+        <w:rPr>
+          <w:sz w:val="28"/>
+          <w:szCs w:val="28"/>
+        </w:rPr>
+        <w:tab/>
+      </w:r>
+      <w:r>
+        <w:rPr>
+          <w:sz w:val="28"/>
+          <w:szCs w:val="28"/>
+        </w:rPr>
+        <w:t>◄</w:t>
+      </w:r>
+      <w:r>
+        <w:rPr>
+          <w:rFonts w:hint="eastAsia"/>
+          <w:sz w:val="28"/>
+          <w:szCs w:val="28"/>
+        </w:rPr>
+        <w:t>────</w:t>
+      </w:r>
+    </w:p>
+    <w:p>
+      <w:pPr>
+        <w:pStyle w:val="NormalWeb"/>
+        <w:ind w:left="720"/>
+        <w:rPr>
+          <w:sz w:val="28"/>
+          <w:szCs w:val="28"/>
+        </w:rPr>
+      </w:pPr>
+      <w:r>
+        <w:rPr>
+          <w:sz w:val="28"/>
+          <w:szCs w:val="28"/>
+        </w:rPr>
+        <w:t xml:space="preserve">             ε (</w:t>
+      </w:r>
+      <w:proofErr w:type="gramStart"/>
+      <w:r>
+        <w:rPr>
+          <w:sz w:val="28"/>
+          <w:szCs w:val="28"/>
+        </w:rPr>
+        <w:t xml:space="preserve">loop)   </w:t>
+      </w:r>
+      <w:proofErr w:type="gramEnd"/>
+      <w:r>
+        <w:rPr>
+          <w:sz w:val="28"/>
+          <w:szCs w:val="28"/>
+        </w:rPr>
+        <w:t xml:space="preserve">                                       </w:t>
+      </w:r>
+      <w:r>
+        <w:rPr>
+          <w:sz w:val="28"/>
+          <w:szCs w:val="28"/>
+        </w:rPr>
+        <w:tab/>
+      </w:r>
+      <w:proofErr w:type="gramStart"/>
+      <w:r>
+        <w:rPr>
+          <w:sz w:val="28"/>
+          <w:szCs w:val="28"/>
+        </w:rPr>
+        <w:tab/>
+        <w:t xml:space="preserve">  </w:t>
+      </w:r>
+      <w:r>
+        <w:rPr>
+          <w:sz w:val="28"/>
+          <w:szCs w:val="28"/>
+        </w:rPr>
+        <w:t>ε</w:t>
+      </w:r>
+      <w:proofErr w:type="gramEnd"/>
+      <w:r>
+        <w:rPr>
+          <w:sz w:val="28"/>
+          <w:szCs w:val="28"/>
+        </w:rPr>
+        <w:t xml:space="preserve"> (loop)</w:t>
+      </w:r>
+    </w:p>
+    <w:p>
+      <w:pPr>
+        <w:pStyle w:val="NormalWeb"/>
+        <w:ind w:left="720"/>
+        <w:rPr>
+          <w:sz w:val="28"/>
+          <w:szCs w:val="28"/>
+        </w:rPr>
+      </w:pPr>
+      <w:r>
+        <w:rPr>
+          <w:sz w:val="28"/>
+          <w:szCs w:val="28"/>
+        </w:rPr>
+        <w:t>Identifier</w:t>
+      </w:r>
+      <w:r>
+        <w:rPr>
+          <w:sz w:val="28"/>
+          <w:szCs w:val="28"/>
+        </w:rPr>
+        <w:t xml:space="preserve">: </w:t>
+      </w:r>
+      <w:r>
+        <w:rPr>
+          <w:sz w:val="28"/>
+          <w:szCs w:val="28"/>
+        </w:rPr>
+        <w:t>[a-</w:t>
+      </w:r>
+      <w:proofErr w:type="spellStart"/>
+      <w:r>
+        <w:rPr>
+          <w:sz w:val="28"/>
+          <w:szCs w:val="28"/>
+        </w:rPr>
+        <w:t>zA</w:t>
+      </w:r>
+      <w:proofErr w:type="spellEnd"/>
+      <w:r>
+        <w:rPr>
+          <w:sz w:val="28"/>
+          <w:szCs w:val="28"/>
+        </w:rPr>
+        <w:t>-Z</w:t>
+      </w:r>
+      <w:proofErr w:type="gramStart"/>
+      <w:r>
+        <w:rPr>
+          <w:sz w:val="28"/>
+          <w:szCs w:val="28"/>
+        </w:rPr>
+        <w:t>_][</w:t>
+      </w:r>
+      <w:proofErr w:type="gramEnd"/>
+      <w:r>
+        <w:rPr>
+          <w:sz w:val="28"/>
+          <w:szCs w:val="28"/>
+        </w:rPr>
+        <w:t>a-zA-Z0-9</w:t>
+      </w:r>
+      <w:proofErr w:type="gramStart"/>
+      <w:r>
+        <w:rPr>
+          <w:sz w:val="28"/>
+          <w:szCs w:val="28"/>
+        </w:rPr>
+        <w:t>_</w:t>
+      </w:r>
+      <w:r>
+        <w:rPr>
+          <w:sz w:val="28"/>
+          <w:szCs w:val="28"/>
+        </w:rPr>
+        <w:t>]*</w:t>
+      </w:r>
+      <w:proofErr w:type="gramEnd"/>
+    </w:p>
+    <w:p>
+      <w:pPr>
+        <w:pStyle w:val="NormalWeb"/>
+        <w:ind w:left="720"/>
+        <w:rPr>
+          <w:sz w:val="28"/>
+          <w:szCs w:val="28"/>
+        </w:rPr>
+      </w:pPr>
+      <w:r>
+        <w:rPr>
+          <w:sz w:val="28"/>
+          <w:szCs w:val="28"/>
+        </w:rPr>
+        <w:t xml:space="preserve">      </w:t>
+      </w:r>
+      <w:r>
+        <w:rPr>
+          <w:sz w:val="28"/>
+          <w:szCs w:val="28"/>
+        </w:rPr>
+        <w:tab/>
+      </w:r>
+      <w:r>
+        <w:rPr>
+          <w:sz w:val="28"/>
+          <w:szCs w:val="28"/>
+        </w:rPr>
+        <w:t xml:space="preserve"> letter|_             </w:t>
+      </w:r>
+      <w:r>
+        <w:rPr>
+          <w:sz w:val="28"/>
+          <w:szCs w:val="28"/>
+        </w:rPr>
+        <w:tab/>
+      </w:r>
+      <w:r>
+        <w:rPr>
+          <w:sz w:val="28"/>
+          <w:szCs w:val="28"/>
+        </w:rPr>
+        <w:tab/>
+      </w:r>
+      <w:r>
+        <w:rPr>
+          <w:sz w:val="28"/>
+          <w:szCs w:val="28"/>
+        </w:rPr>
+        <w:t xml:space="preserve">ε          </w:t>
+      </w:r>
+      <w:r>
+        <w:rPr>
+          <w:sz w:val="28"/>
+          <w:szCs w:val="28"/>
+        </w:rPr>
+        <w:tab/>
+      </w:r>
+      <w:proofErr w:type="spellStart"/>
+      <w:r>
+        <w:rPr>
+          <w:sz w:val="28"/>
+          <w:szCs w:val="28"/>
+        </w:rPr>
+        <w:t>letter|digit</w:t>
+      </w:r>
+      <w:proofErr w:type="spellEnd"/>
+      <w:r>
+        <w:rPr>
+          <w:sz w:val="28"/>
+          <w:szCs w:val="28"/>
+        </w:rPr>
+        <w:t>|_</w:t>
+      </w:r>
+      <w:r>
+        <w:rPr>
+          <w:sz w:val="28"/>
+          <w:szCs w:val="28"/>
+        </w:rPr>
+        <w:br/>
+      </w:r>
+      <w:r>
+        <w:rPr>
+          <w:sz w:val="28"/>
+          <w:szCs w:val="28"/>
+        </w:rPr>
+        <w:sym w:font="Wingdings" w:char="F0E0"/>
+      </w:r>
+      <w:r>
+        <w:rPr>
+          <w:sz w:val="28"/>
+          <w:szCs w:val="28"/>
+        </w:rPr>
+        <w:t xml:space="preserve"> </w:t>
+      </w:r>
+      <w:r>
+        <w:rPr>
+          <w:sz w:val="28"/>
+          <w:szCs w:val="28"/>
+        </w:rPr>
+        <w:t xml:space="preserve">q0 </w:t>
+      </w:r>
+      <w:r>
+        <w:rPr>
+          <w:rFonts w:hint="eastAsia"/>
+          <w:sz w:val="28"/>
+          <w:szCs w:val="28"/>
+        </w:rPr>
+        <w:t>─────</w:t>
+      </w:r>
+      <w:r>
+        <w:rPr>
+          <w:sz w:val="28"/>
+          <w:szCs w:val="28"/>
+        </w:rPr>
+        <w:t xml:space="preserve">► q1 (acc) </w:t>
+      </w:r>
+      <w:r>
+        <w:rPr>
+          <w:rFonts w:hint="eastAsia"/>
+          <w:sz w:val="28"/>
+          <w:szCs w:val="28"/>
+        </w:rPr>
+        <w:t>──────</w:t>
+      </w:r>
+      <w:r>
+        <w:rPr>
+          <w:sz w:val="28"/>
+          <w:szCs w:val="28"/>
+        </w:rPr>
+        <w:t>► q2</w:t>
+      </w:r>
+      <w:r>
+        <w:rPr>
+          <w:rFonts w:hint="eastAsia"/>
+          <w:sz w:val="28"/>
+          <w:szCs w:val="28"/>
+        </w:rPr>
+        <w:t>───────</w:t>
+      </w:r>
+      <w:r>
+        <w:rPr>
+          <w:sz w:val="28"/>
+          <w:szCs w:val="28"/>
+        </w:rPr>
+        <w:t>► q3 (acc)</w:t>
+      </w:r>
+    </w:p>
+    <w:p>
+      <w:pPr>
+        <w:pStyle w:val="NormalWeb"/>
+        <w:ind w:left="720"/>
+        <w:rPr>
+          <w:sz w:val="28"/>
+          <w:szCs w:val="28"/>
+        </w:rPr>
+      </w:pPr>
+      <w:r>
+        <w:rPr>
+          <w:sz w:val="28"/>
+          <w:szCs w:val="28"/>
+        </w:rPr>
+        <w:t xml:space="preserve">                              </w:t>
+      </w:r>
+      <w:r>
+        <w:rPr>
+          <w:sz w:val="28"/>
+          <w:szCs w:val="28"/>
+        </w:rPr>
+        <w:tab/>
+      </w:r>
+      <w:r>
+        <w:rPr>
+          <w:sz w:val="28"/>
+          <w:szCs w:val="28"/>
+        </w:rPr>
+        <w:tab/>
+      </w:r>
+      <w:r>
+        <w:rPr>
+          <w:sz w:val="28"/>
+          <w:szCs w:val="28"/>
+        </w:rPr>
+        <w:t>◄</w:t>
+      </w:r>
+      <w:r>
+        <w:rPr>
+          <w:rFonts w:hint="eastAsia"/>
+          <w:sz w:val="28"/>
+          <w:szCs w:val="28"/>
+        </w:rPr>
+        <w:t>─────────────</w:t>
+      </w:r>
+      <w:r>
+        <w:rPr>
+          <w:rFonts w:hint="eastAsia"/>
+          <w:sz w:val="28"/>
+          <w:szCs w:val="28"/>
+        </w:rPr>
+        <w:t>──────</w:t>
+      </w:r>
+    </w:p>
+    <w:p>
+      <w:pPr>
+        <w:pStyle w:val="NormalWeb"/>
+        <w:ind w:left="720"/>
+        <w:rPr>
+          <w:sz w:val="28"/>
+          <w:szCs w:val="28"/>
+        </w:rPr>
+      </w:pPr>
+      <w:r>
+        <w:rPr>
+          <w:sz w:val="28"/>
+          <w:szCs w:val="28"/>
+        </w:rPr>
+        <w:t xml:space="preserve">                                         </w:t>
+      </w:r>
+      <w:r>
+        <w:rPr>
+          <w:sz w:val="28"/>
+          <w:szCs w:val="28"/>
+        </w:rPr>
+        <w:tab/>
+      </w:r>
+      <w:r>
+        <w:rPr>
+          <w:sz w:val="28"/>
+          <w:szCs w:val="28"/>
+        </w:rPr>
+        <w:tab/>
+      </w:r>
+      <w:r>
+        <w:rPr>
+          <w:sz w:val="28"/>
+          <w:szCs w:val="28"/>
+        </w:rPr>
+        <w:tab/>
+      </w:r>
+      <w:r>
+        <w:rPr>
+          <w:sz w:val="28"/>
+          <w:szCs w:val="28"/>
+        </w:rPr>
+        <w:t>ε (loop)</w:t>
+      </w:r>
+    </w:p>
+    <w:p>
+      <w:pPr>
+        <w:pStyle w:val="NormalWeb"/>
+        <w:ind w:left="720"/>
+        <w:rPr>
+          <w:b/>
+          <w:bCs/>
+          <w:sz w:val="28"/>
+          <w:szCs w:val="28"/>
+          <w:u w:val="single"/>
+        </w:rPr>
+      </w:pPr>
+      <w:r>
+        <w:rPr>
+          <w:b/>
+          <w:bCs/>
+          <w:sz w:val="28"/>
+          <w:szCs w:val="28"/>
+          <w:u w:val="single"/>
+        </w:rPr>
+        <w:t xml:space="preserve">Conversion from NFSM to DFSM </w:t>
+      </w:r>
+      <w:r>
+        <w:rPr>
+          <w:b/>
+          <w:bCs/>
+          <w:sz w:val="28"/>
+          <w:szCs w:val="28"/>
+          <w:u w:val="single"/>
+        </w:rPr>
+        <w:t>(</w:t>
+      </w:r>
+      <w:r>
+        <w:rPr>
+          <w:b/>
+          <w:bCs/>
+          <w:sz w:val="28"/>
+          <w:szCs w:val="28"/>
+          <w:u w:val="single"/>
+        </w:rPr>
+        <w:t>Subset</w:t>
+      </w:r>
+      <w:r>
+        <w:rPr>
+          <w:b/>
+          <w:bCs/>
+          <w:sz w:val="28"/>
+          <w:szCs w:val="28"/>
+          <w:u w:val="single"/>
+        </w:rPr>
+        <w:t xml:space="preserve"> </w:t>
+      </w:r>
+      <w:r>
+        <w:rPr>
+          <w:b/>
+          <w:bCs/>
+          <w:sz w:val="28"/>
+          <w:szCs w:val="28"/>
+          <w:u w:val="single"/>
+        </w:rPr>
+        <w:t>Construction</w:t>
+      </w:r>
+      <w:r>
+        <w:rPr>
+          <w:b/>
+          <w:bCs/>
+          <w:sz w:val="28"/>
+          <w:szCs w:val="28"/>
+          <w:u w:val="single"/>
+        </w:rPr>
+        <w:t>)</w:t>
+      </w:r>
+      <w:r>
+        <w:rPr>
+          <w:b/>
+          <w:bCs/>
+          <w:sz w:val="28"/>
+          <w:szCs w:val="28"/>
+          <w:u w:val="single"/>
+        </w:rPr>
+        <w:t xml:space="preserve">: </w:t>
+      </w:r>
+      <w:r>
+        <w:rPr>
+          <w:sz w:val="28"/>
+          <w:szCs w:val="28"/>
+        </w:rPr>
+        <w:t xml:space="preserve">Subset </w:t>
+      </w:r>
+      <w:r>
+        <w:rPr>
+          <w:sz w:val="28"/>
+          <w:szCs w:val="28"/>
+        </w:rPr>
+        <w:t>co</w:t>
+      </w:r>
+      <w:r>
+        <w:rPr>
+          <w:sz w:val="28"/>
+          <w:szCs w:val="28"/>
+        </w:rPr>
+        <w:t>nstruction eliminates non-determinism by computing the ε-closure of each reachable set of NFSM states and treating each unique set as a single DFSM state. The three individual DFSMs are then merged into one combined machine with a shared START state.</w:t>
+      </w:r>
+    </w:p>
+    <w:p>
+      <w:pPr>
+        <w:pStyle w:val="NormalWeb"/>
+        <w:ind w:left="720"/>
+        <w:rPr>
+          <w:rFonts w:hint="eastAsia"/>
+          <w:sz w:val="28"/>
+          <w:szCs w:val="28"/>
+        </w:rPr>
+      </w:pPr>
+      <w:r>
+        <w:rPr>
+          <w:sz w:val="28"/>
+          <w:szCs w:val="28"/>
+        </w:rPr>
+        <w:t>Integer</w:t>
+      </w:r>
+      <w:r>
+        <w:rPr>
+          <w:sz w:val="28"/>
+          <w:szCs w:val="28"/>
+        </w:rPr>
+        <w:t xml:space="preserve">: </w:t>
+      </w:r>
+      <w:r>
+        <w:rPr>
+          <w:rFonts w:hint="eastAsia"/>
+          <w:sz w:val="28"/>
+          <w:szCs w:val="28"/>
+        </w:rPr>
+        <w:t>The ε-closure of q1 includes q2 (the ε-edge into the loop). Any further digit loops through q2 → q3 → q2, which always resolves to the same set. The entire loop collapses into one self-looping DFSM state</w:t>
+      </w:r>
+      <w:r>
+        <w:rPr>
+          <w:sz w:val="28"/>
+          <w:szCs w:val="28"/>
+        </w:rPr>
+        <w:t>.</w:t>
+      </w:r>
+    </w:p>
+    <w:p>
+      <w:pPr>
+        <w:pStyle w:val="NormalWeb"/>
+        <w:ind w:left="720"/>
+        <w:rPr>
+          <w:sz w:val="28"/>
+          <w:szCs w:val="28"/>
+        </w:rPr>
+      </w:pPr>
+      <w:r>
+        <w:rPr>
+          <w:sz w:val="28"/>
+          <w:szCs w:val="28"/>
+        </w:rPr>
+        <w:t xml:space="preserve">S0 = </w:t>
+      </w:r>
+      <w:proofErr w:type="gramStart"/>
+      <w:r>
+        <w:rPr>
+          <w:sz w:val="28"/>
+          <w:szCs w:val="28"/>
+        </w:rPr>
+        <w:t>{ q0 }</w:t>
+      </w:r>
+      <w:proofErr w:type="gramEnd"/>
+      <w:r>
+        <w:rPr>
+          <w:sz w:val="28"/>
+          <w:szCs w:val="28"/>
+        </w:rPr>
+        <w:t xml:space="preserve">          </w:t>
+      </w:r>
+      <w:r>
+        <w:rPr>
+          <w:sz w:val="28"/>
+          <w:szCs w:val="28"/>
+        </w:rPr>
+        <w:tab/>
+      </w:r>
+      <w:r>
+        <w:rPr>
+          <w:sz w:val="28"/>
+          <w:szCs w:val="28"/>
+        </w:rPr>
+        <w:t xml:space="preserve">START  </w:t>
+      </w:r>
+      <w:proofErr w:type="gramStart"/>
+      <w:r>
+        <w:rPr>
+          <w:sz w:val="28"/>
+          <w:szCs w:val="28"/>
+        </w:rPr>
+        <w:t xml:space="preserve">   (</w:t>
+      </w:r>
+      <w:proofErr w:type="gramEnd"/>
+      <w:r>
+        <w:rPr>
+          <w:sz w:val="28"/>
+          <w:szCs w:val="28"/>
+        </w:rPr>
+        <w:t>non-accepting)</w:t>
+      </w:r>
+    </w:p>
+    <w:p>
+      <w:pPr>
+        <w:pStyle w:val="NormalWeb"/>
+        <w:ind w:left="720"/>
+        <w:rPr>
+          <w:sz w:val="28"/>
+          <w:szCs w:val="28"/>
+        </w:rPr>
+      </w:pPr>
+      <w:r>
+        <w:rPr>
+          <w:sz w:val="28"/>
+          <w:szCs w:val="28"/>
+        </w:rPr>
+        <w:t xml:space="preserve">S1 = </w:t>
+      </w:r>
+      <w:proofErr w:type="gramStart"/>
+      <w:r>
+        <w:rPr>
+          <w:sz w:val="28"/>
+          <w:szCs w:val="28"/>
+        </w:rPr>
+        <w:t>{ q</w:t>
+      </w:r>
+      <w:proofErr w:type="gramEnd"/>
+      <w:r>
+        <w:rPr>
+          <w:sz w:val="28"/>
+          <w:szCs w:val="28"/>
+        </w:rPr>
+        <w:t>1, q2, q</w:t>
+      </w:r>
+      <w:proofErr w:type="gramStart"/>
+      <w:r>
+        <w:rPr>
+          <w:sz w:val="28"/>
+          <w:szCs w:val="28"/>
+        </w:rPr>
+        <w:t>3 }</w:t>
+      </w:r>
+      <w:proofErr w:type="gramEnd"/>
+      <w:r>
+        <w:rPr>
+          <w:sz w:val="28"/>
+          <w:szCs w:val="28"/>
+        </w:rPr>
+        <w:t xml:space="preserve"> INTEGER (accepting) </w:t>
+      </w:r>
+      <w:r>
+        <w:rPr>
+          <w:sz w:val="28"/>
+          <w:szCs w:val="28"/>
+        </w:rPr>
+        <w:t xml:space="preserve">-- </w:t>
+      </w:r>
+      <w:r>
+        <w:rPr>
+          <w:sz w:val="28"/>
+          <w:szCs w:val="28"/>
+        </w:rPr>
+        <w:t>self-loop on digit</w:t>
+      </w:r>
+    </w:p>
+    <w:p>
+      <w:pPr>
+        <w:spacing w:after="200" w:line="276" w:lineRule="auto"/>
+        <w:rPr>
+          <w:rFonts w:eastAsia="Times New Roman"/>
+          <w:sz w:val="28"/>
+          <w:szCs w:val="28"/>
+        </w:rPr>
+      </w:pPr>
+      <w:r>
+        <w:rPr>
+          <w:sz w:val="28"/>
+          <w:szCs w:val="28"/>
+        </w:rPr>
+        <w:br w:type="page"/>
+      </w:r>
+    </w:p>
+    <w:p>
+      <w:pPr>
+        <w:pStyle w:val="NormalWeb"/>
+        <w:ind w:left="720"/>
+        <w:rPr>
+          <w:sz w:val="28"/>
+          <w:szCs w:val="28"/>
+        </w:rPr>
+      </w:pPr>
+      <w:r>
+        <w:rPr>
+          <w:sz w:val="28"/>
+          <w:szCs w:val="28"/>
+        </w:rPr>
+        <w:lastRenderedPageBreak/>
+        <w:t>Real</w:t>
+      </w:r>
+      <w:r>
+        <w:rPr>
+          <w:sz w:val="28"/>
+          <w:szCs w:val="28"/>
+        </w:rPr>
+        <w:t xml:space="preserve">: </w:t>
+      </w:r>
+      <w:r>
+        <w:rPr>
+          <w:sz w:val="28"/>
+          <w:szCs w:val="28"/>
+        </w:rPr>
+        <w:t>Four DFSM states result. S1 is non-accepting for real because seeing only digits without a '.' is not a real number. S2 is non-accepting because the '.' has been seen but no fractional digits yet</w:t>
+      </w:r>
+      <w:r>
+        <w:rPr>
+          <w:sz w:val="28"/>
+          <w:szCs w:val="28"/>
+        </w:rPr>
+        <w:t>.</w:t>
+      </w:r>
+    </w:p>
+    <w:tbl>
+      <w:tblPr>
+        <w:tblStyle w:val="TableGrid"/>
+        <w:tblW w:w="8550" w:type="dxa"/>
+        <w:tblInd w:w="355" w:type="dxa"/>
+        <w:tblLook w:val="04A0" w:firstRow="1" w:lastRow="0" w:firstColumn="1" w:lastColumn="0" w:noHBand="0" w:noVBand="1"/>
+      </w:tblPr>
+      <w:tblGrid>
+        <w:gridCol w:w="1800"/>
+        <w:gridCol w:w="1739"/>
+        <w:gridCol w:w="1553"/>
+        <w:gridCol w:w="1524"/>
+        <w:gridCol w:w="1934"/>
+      </w:tblGrid>
+      <w:tr>
+        <w:tc>
+          <w:tcPr>
+            <w:tcW w:w="1800" w:type="dxa"/>
+          </w:tcPr>
+          <w:p>
+            <w:pPr>
+              <w:pStyle w:val="NormalWeb"/>
+              <w:rPr>
+                <w:sz w:val="28"/>
+                <w:szCs w:val="28"/>
+              </w:rPr>
+            </w:pPr>
+            <w:r>
+              <w:rPr>
+                <w:sz w:val="28"/>
+                <w:szCs w:val="28"/>
+              </w:rPr>
+              <w:t>DFSM State</w:t>
+            </w:r>
+          </w:p>
+        </w:tc>
+        <w:tc>
+          <w:tcPr>
+            <w:tcW w:w="1739" w:type="dxa"/>
+          </w:tcPr>
+          <w:p>
+            <w:pPr>
+              <w:pStyle w:val="NormalWeb"/>
+              <w:rPr>
+                <w:sz w:val="28"/>
+                <w:szCs w:val="28"/>
+              </w:rPr>
+            </w:pPr>
+            <w:r>
+              <w:rPr>
+                <w:sz w:val="28"/>
+                <w:szCs w:val="28"/>
+              </w:rPr>
+              <w:t>NFSM State</w:t>
+            </w:r>
+          </w:p>
+        </w:tc>
+        <w:tc>
+          <w:tcPr>
+            <w:tcW w:w="1553" w:type="dxa"/>
+          </w:tcPr>
+          <w:p>
+            <w:pPr>
+              <w:pStyle w:val="NormalWeb"/>
+              <w:rPr>
+                <w:sz w:val="28"/>
+                <w:szCs w:val="28"/>
+              </w:rPr>
+            </w:pPr>
+            <w:r>
+              <w:rPr>
+                <w:sz w:val="28"/>
+                <w:szCs w:val="28"/>
+              </w:rPr>
+              <w:t>On Digit</w:t>
+            </w:r>
+          </w:p>
+        </w:tc>
+        <w:tc>
+          <w:tcPr>
+            <w:tcW w:w="1524" w:type="dxa"/>
+          </w:tcPr>
+          <w:p>
+            <w:pPr>
+              <w:pStyle w:val="NormalWeb"/>
+              <w:rPr>
+                <w:sz w:val="28"/>
+                <w:szCs w:val="28"/>
+              </w:rPr>
+            </w:pPr>
+            <w:r>
+              <w:rPr>
+                <w:sz w:val="28"/>
+                <w:szCs w:val="28"/>
+              </w:rPr>
+              <w:t>On Dot</w:t>
+            </w:r>
+          </w:p>
+        </w:tc>
+        <w:tc>
+          <w:tcPr>
+            <w:tcW w:w="1934" w:type="dxa"/>
+          </w:tcPr>
+          <w:p>
+            <w:pPr>
+              <w:pStyle w:val="NormalWeb"/>
+              <w:rPr>
+                <w:sz w:val="28"/>
+                <w:szCs w:val="28"/>
+              </w:rPr>
+            </w:pPr>
+            <w:r>
+              <w:rPr>
+                <w:sz w:val="28"/>
+                <w:szCs w:val="28"/>
+              </w:rPr>
+              <w:t>Accepting</w:t>
+            </w:r>
+          </w:p>
+        </w:tc>
+      </w:tr>
+      <w:tr>
+        <w:tc>
+          <w:tcPr>
+            <w:tcW w:w="1800" w:type="dxa"/>
+          </w:tcPr>
+          <w:p>
+            <w:pPr>
+              <w:pStyle w:val="NormalWeb"/>
+              <w:rPr>
+                <w:sz w:val="28"/>
+                <w:szCs w:val="28"/>
+              </w:rPr>
+            </w:pPr>
+            <w:r>
+              <w:rPr>
+                <w:sz w:val="28"/>
+                <w:szCs w:val="28"/>
+              </w:rPr>
+              <w:t>S0</w:t>
+            </w:r>
+          </w:p>
+        </w:tc>
+        <w:tc>
+          <w:tcPr>
+            <w:tcW w:w="1739" w:type="dxa"/>
+          </w:tcPr>
+          <w:p>
+            <w:pPr>
+              <w:pStyle w:val="NormalWeb"/>
+              <w:rPr>
+                <w:sz w:val="28"/>
+                <w:szCs w:val="28"/>
+              </w:rPr>
+            </w:pPr>
+            <w:r>
+              <w:rPr>
+                <w:sz w:val="28"/>
+                <w:szCs w:val="28"/>
+              </w:rPr>
+              <w:t>{q0}</w:t>
+            </w:r>
+          </w:p>
+        </w:tc>
+        <w:tc>
+          <w:tcPr>
+            <w:tcW w:w="1553" w:type="dxa"/>
+          </w:tcPr>
+          <w:p>
+            <w:pPr>
+              <w:pStyle w:val="NormalWeb"/>
+              <w:rPr>
+                <w:sz w:val="28"/>
+                <w:szCs w:val="28"/>
+              </w:rPr>
+            </w:pPr>
+            <w:r>
+              <w:rPr>
+                <w:sz w:val="28"/>
+                <w:szCs w:val="28"/>
+              </w:rPr>
+              <w:t>S1</w:t>
+            </w:r>
+          </w:p>
+        </w:tc>
+        <w:tc>
+          <w:tcPr>
+            <w:tcW w:w="1524" w:type="dxa"/>
+          </w:tcPr>
+          <w:p>
+            <w:pPr>
+              <w:pStyle w:val="NormalWeb"/>
+              <w:rPr>
+                <w:sz w:val="28"/>
+                <w:szCs w:val="28"/>
+              </w:rPr>
+            </w:pPr>
+            <w:r>
+              <w:rPr>
+                <w:sz w:val="28"/>
+                <w:szCs w:val="28"/>
+              </w:rPr>
+              <w:t>-</w:t>
+            </w:r>
+          </w:p>
+        </w:tc>
+        <w:tc>
+          <w:tcPr>
+            <w:tcW w:w="1934" w:type="dxa"/>
+          </w:tcPr>
+          <w:p>
+            <w:pPr>
+              <w:pStyle w:val="NormalWeb"/>
+              <w:rPr>
+                <w:sz w:val="28"/>
+                <w:szCs w:val="28"/>
+              </w:rPr>
+            </w:pPr>
+            <w:r>
+              <w:rPr>
+                <w:sz w:val="28"/>
+                <w:szCs w:val="28"/>
+              </w:rPr>
+              <w:t>No</w:t>
+            </w:r>
+          </w:p>
+        </w:tc>
+      </w:tr>
+      <w:tr>
+        <w:tc>
+          <w:tcPr>
+            <w:tcW w:w="1800" w:type="dxa"/>
+          </w:tcPr>
+          <w:p>
+            <w:pPr>
+              <w:pStyle w:val="NormalWeb"/>
+              <w:rPr>
+                <w:sz w:val="28"/>
+                <w:szCs w:val="28"/>
+              </w:rPr>
+            </w:pPr>
+            <w:r>
+              <w:rPr>
+                <w:sz w:val="28"/>
+                <w:szCs w:val="28"/>
+              </w:rPr>
+              <w:t>S1</w:t>
+            </w:r>
+          </w:p>
+        </w:tc>
+        <w:tc>
+          <w:tcPr>
+            <w:tcW w:w="1739" w:type="dxa"/>
+          </w:tcPr>
+          <w:p>
+            <w:pPr>
+              <w:pStyle w:val="NormalWeb"/>
+              <w:rPr>
+                <w:sz w:val="28"/>
+                <w:szCs w:val="28"/>
+              </w:rPr>
+            </w:pPr>
+            <w:r>
+              <w:rPr>
+                <w:sz w:val="28"/>
+                <w:szCs w:val="28"/>
+              </w:rPr>
+              <w:t>{q</w:t>
+            </w:r>
+            <w:proofErr w:type="gramStart"/>
+            <w:r>
+              <w:rPr>
+                <w:sz w:val="28"/>
+                <w:szCs w:val="28"/>
+              </w:rPr>
+              <w:t>1,q2,q</w:t>
+            </w:r>
+            <w:proofErr w:type="gramEnd"/>
+            <w:r>
+              <w:rPr>
+                <w:sz w:val="28"/>
+                <w:szCs w:val="28"/>
+              </w:rPr>
+              <w:t>3}</w:t>
+            </w:r>
+          </w:p>
+        </w:tc>
+        <w:tc>
+          <w:tcPr>
+            <w:tcW w:w="1553" w:type="dxa"/>
+          </w:tcPr>
+          <w:p>
+            <w:pPr>
+              <w:pStyle w:val="NormalWeb"/>
+              <w:rPr>
+                <w:sz w:val="28"/>
+                <w:szCs w:val="28"/>
+              </w:rPr>
+            </w:pPr>
+            <w:r>
+              <w:rPr>
+                <w:sz w:val="28"/>
+                <w:szCs w:val="28"/>
+              </w:rPr>
+              <w:t>S1</w:t>
+            </w:r>
+          </w:p>
+        </w:tc>
+        <w:tc>
+          <w:tcPr>
+            <w:tcW w:w="1524" w:type="dxa"/>
+          </w:tcPr>
+          <w:p>
+            <w:pPr>
+              <w:pStyle w:val="NormalWeb"/>
+              <w:rPr>
+                <w:sz w:val="28"/>
+                <w:szCs w:val="28"/>
+              </w:rPr>
+            </w:pPr>
+            <w:r>
+              <w:rPr>
+                <w:sz w:val="28"/>
+                <w:szCs w:val="28"/>
+              </w:rPr>
+              <w:t>S2</w:t>
+            </w:r>
+          </w:p>
+        </w:tc>
+        <w:tc>
+          <w:tcPr>
+            <w:tcW w:w="1934" w:type="dxa"/>
+          </w:tcPr>
+          <w:p>
+            <w:pPr>
+              <w:pStyle w:val="NormalWeb"/>
+              <w:rPr>
+                <w:sz w:val="28"/>
+                <w:szCs w:val="28"/>
+              </w:rPr>
+            </w:pPr>
+            <w:r>
+              <w:rPr>
+                <w:sz w:val="28"/>
+                <w:szCs w:val="28"/>
+              </w:rPr>
+              <w:t>No</w:t>
+            </w:r>
+          </w:p>
+        </w:tc>
+      </w:tr>
+      <w:tr>
+        <w:tc>
+          <w:tcPr>
+            <w:tcW w:w="1800" w:type="dxa"/>
+          </w:tcPr>
+          <w:p>
+            <w:pPr>
+              <w:pStyle w:val="NormalWeb"/>
+              <w:rPr>
+                <w:sz w:val="28"/>
+                <w:szCs w:val="28"/>
+              </w:rPr>
+            </w:pPr>
+            <w:r>
+              <w:rPr>
+                <w:sz w:val="28"/>
+                <w:szCs w:val="28"/>
+              </w:rPr>
+              <w:t>S2</w:t>
+            </w:r>
+          </w:p>
+        </w:tc>
+        <w:tc>
+          <w:tcPr>
+            <w:tcW w:w="1739" w:type="dxa"/>
+          </w:tcPr>
+          <w:p>
+            <w:pPr>
+              <w:pStyle w:val="NormalWeb"/>
+              <w:rPr>
+                <w:sz w:val="28"/>
+                <w:szCs w:val="28"/>
+              </w:rPr>
+            </w:pPr>
+            <w:r>
+              <w:rPr>
+                <w:sz w:val="28"/>
+                <w:szCs w:val="28"/>
+              </w:rPr>
+              <w:t>{q</w:t>
+            </w:r>
+            <w:proofErr w:type="gramStart"/>
+            <w:r>
+              <w:rPr>
+                <w:sz w:val="28"/>
+                <w:szCs w:val="28"/>
+              </w:rPr>
+              <w:t>3,q</w:t>
+            </w:r>
+            <w:proofErr w:type="gramEnd"/>
+            <w:r>
+              <w:rPr>
+                <w:sz w:val="28"/>
+                <w:szCs w:val="28"/>
+              </w:rPr>
+              <w:t>4}</w:t>
+            </w:r>
+          </w:p>
+        </w:tc>
+        <w:tc>
+          <w:tcPr>
+            <w:tcW w:w="1553" w:type="dxa"/>
+          </w:tcPr>
+          <w:p>
+            <w:pPr>
+              <w:pStyle w:val="NormalWeb"/>
+              <w:rPr>
+                <w:sz w:val="28"/>
+                <w:szCs w:val="28"/>
+              </w:rPr>
+            </w:pPr>
+            <w:r>
+              <w:rPr>
+                <w:sz w:val="28"/>
+                <w:szCs w:val="28"/>
+              </w:rPr>
+              <w:t>S3</w:t>
+            </w:r>
+          </w:p>
+        </w:tc>
+        <w:tc>
+          <w:tcPr>
+            <w:tcW w:w="1524" w:type="dxa"/>
+          </w:tcPr>
+          <w:p>
+            <w:pPr>
+              <w:pStyle w:val="NormalWeb"/>
+              <w:rPr>
+                <w:sz w:val="28"/>
+                <w:szCs w:val="28"/>
+              </w:rPr>
+            </w:pPr>
+            <w:r>
+              <w:rPr>
+                <w:sz w:val="28"/>
+                <w:szCs w:val="28"/>
+              </w:rPr>
+              <w:t>-</w:t>
+            </w:r>
+          </w:p>
+        </w:tc>
+        <w:tc>
+          <w:tcPr>
+            <w:tcW w:w="1934" w:type="dxa"/>
+          </w:tcPr>
+          <w:p>
+            <w:pPr>
+              <w:pStyle w:val="NormalWeb"/>
+              <w:rPr>
+                <w:sz w:val="28"/>
+                <w:szCs w:val="28"/>
+              </w:rPr>
+            </w:pPr>
+            <w:r>
+              <w:rPr>
+                <w:sz w:val="28"/>
+                <w:szCs w:val="28"/>
+              </w:rPr>
+              <w:t>No</w:t>
+            </w:r>
+          </w:p>
+        </w:tc>
+      </w:tr>
+      <w:tr>
+        <w:tc>
+          <w:tcPr>
+            <w:tcW w:w="1800" w:type="dxa"/>
+          </w:tcPr>
+          <w:p>
+            <w:pPr>
+              <w:pStyle w:val="NormalWeb"/>
+              <w:rPr>
+                <w:sz w:val="28"/>
+                <w:szCs w:val="28"/>
+              </w:rPr>
+            </w:pPr>
+            <w:r>
+              <w:rPr>
+                <w:sz w:val="28"/>
+                <w:szCs w:val="28"/>
+              </w:rPr>
+              <w:t>S3</w:t>
+            </w:r>
+          </w:p>
+        </w:tc>
+        <w:tc>
+          <w:tcPr>
+            <w:tcW w:w="1739" w:type="dxa"/>
+          </w:tcPr>
+          <w:p>
+            <w:pPr>
+              <w:pStyle w:val="NormalWeb"/>
+              <w:rPr>
+                <w:sz w:val="28"/>
+                <w:szCs w:val="28"/>
+              </w:rPr>
+            </w:pPr>
+            <w:r>
+              <w:rPr>
+                <w:sz w:val="28"/>
+                <w:szCs w:val="28"/>
+              </w:rPr>
+              <w:t>{q</w:t>
+            </w:r>
+            <w:proofErr w:type="gramStart"/>
+            <w:r>
+              <w:rPr>
+                <w:sz w:val="28"/>
+                <w:szCs w:val="28"/>
+              </w:rPr>
+              <w:t>5,q6,q</w:t>
+            </w:r>
+            <w:proofErr w:type="gramEnd"/>
+            <w:r>
+              <w:rPr>
+                <w:sz w:val="28"/>
+                <w:szCs w:val="28"/>
+              </w:rPr>
+              <w:t>7}</w:t>
+            </w:r>
+          </w:p>
+        </w:tc>
+        <w:tc>
+          <w:tcPr>
+            <w:tcW w:w="1553" w:type="dxa"/>
+          </w:tcPr>
+          <w:p>
+            <w:pPr>
+              <w:pStyle w:val="NormalWeb"/>
+              <w:rPr>
+                <w:sz w:val="28"/>
+                <w:szCs w:val="28"/>
+              </w:rPr>
+            </w:pPr>
+            <w:r>
+              <w:rPr>
+                <w:sz w:val="28"/>
+                <w:szCs w:val="28"/>
+              </w:rPr>
+              <w:t>S3</w:t>
+            </w:r>
+          </w:p>
+        </w:tc>
+        <w:tc>
+          <w:tcPr>
+            <w:tcW w:w="1524" w:type="dxa"/>
+          </w:tcPr>
+          <w:p>
+            <w:pPr>
+              <w:pStyle w:val="NormalWeb"/>
+              <w:rPr>
+                <w:sz w:val="28"/>
+                <w:szCs w:val="28"/>
+              </w:rPr>
+            </w:pPr>
+            <w:r>
+              <w:rPr>
+                <w:sz w:val="28"/>
+                <w:szCs w:val="28"/>
+              </w:rPr>
+              <w:t>-</w:t>
+            </w:r>
+          </w:p>
+        </w:tc>
+        <w:tc>
+          <w:tcPr>
+            <w:tcW w:w="1934" w:type="dxa"/>
+          </w:tcPr>
+          <w:p>
+            <w:pPr>
+              <w:pStyle w:val="NormalWeb"/>
+              <w:rPr>
+                <w:sz w:val="28"/>
+                <w:szCs w:val="28"/>
+              </w:rPr>
+            </w:pPr>
+            <w:r>
+              <w:rPr>
+                <w:sz w:val="28"/>
+                <w:szCs w:val="28"/>
+              </w:rPr>
+              <w:t>Yes</w:t>
+            </w:r>
+          </w:p>
+        </w:tc>
+      </w:tr>
+    </w:tbl>
+    <w:p>
+      <w:pPr>
+        <w:pStyle w:val="NormalWeb"/>
+        <w:ind w:left="720"/>
+        <w:rPr>
+          <w:rFonts w:hint="eastAsia"/>
+          <w:sz w:val="28"/>
+          <w:szCs w:val="28"/>
+        </w:rPr>
+      </w:pPr>
+      <w:r>
+        <w:rPr>
+          <w:sz w:val="28"/>
+          <w:szCs w:val="28"/>
+        </w:rPr>
+        <w:t>Identifier</w:t>
+      </w:r>
+      <w:r>
+        <w:rPr>
+          <w:sz w:val="28"/>
+          <w:szCs w:val="28"/>
+        </w:rPr>
+        <w:t xml:space="preserve">: </w:t>
+      </w:r>
+      <w:r>
+        <w:rPr>
+          <w:rFonts w:hint="eastAsia"/>
+          <w:sz w:val="28"/>
+          <w:szCs w:val="28"/>
+        </w:rPr>
+        <w:t>The ε-closure of q1 includes q2. Any letter, digit, or underscore loops through q2 → q3 → q2, collapsing to one self-looping DFSM state:</w:t>
+      </w:r>
+    </w:p>
+    <w:p>
+      <w:pPr>
+        <w:pStyle w:val="NormalWeb"/>
+        <w:ind w:left="720"/>
+        <w:rPr>
+          <w:sz w:val="28"/>
+          <w:szCs w:val="28"/>
+        </w:rPr>
+      </w:pPr>
+      <w:r>
+        <w:rPr>
+          <w:sz w:val="28"/>
+          <w:szCs w:val="28"/>
+        </w:rPr>
+        <w:t xml:space="preserve">S0 = </w:t>
+      </w:r>
+      <w:proofErr w:type="gramStart"/>
+      <w:r>
+        <w:rPr>
+          <w:sz w:val="28"/>
+          <w:szCs w:val="28"/>
+        </w:rPr>
+        <w:t>{ q0 }</w:t>
+      </w:r>
+      <w:proofErr w:type="gramEnd"/>
+      <w:r>
+        <w:rPr>
+          <w:sz w:val="28"/>
+          <w:szCs w:val="28"/>
+        </w:rPr>
+        <w:t xml:space="preserve">          </w:t>
+      </w:r>
+      <w:r>
+        <w:rPr>
+          <w:sz w:val="28"/>
+          <w:szCs w:val="28"/>
+        </w:rPr>
+        <w:t xml:space="preserve"> </w:t>
+      </w:r>
+      <w:r>
+        <w:rPr>
+          <w:sz w:val="28"/>
+          <w:szCs w:val="28"/>
+        </w:rPr>
+        <w:t xml:space="preserve"> START       </w:t>
+      </w:r>
+      <w:r>
+        <w:rPr>
+          <w:sz w:val="28"/>
+          <w:szCs w:val="28"/>
+        </w:rPr>
+        <w:t xml:space="preserve"> </w:t>
+      </w:r>
+      <w:proofErr w:type="gramStart"/>
+      <w:r>
+        <w:rPr>
+          <w:sz w:val="28"/>
+          <w:szCs w:val="28"/>
+        </w:rPr>
+        <w:t xml:space="preserve">   </w:t>
+      </w:r>
+      <w:r>
+        <w:rPr>
+          <w:sz w:val="28"/>
+          <w:szCs w:val="28"/>
+        </w:rPr>
+        <w:t>(</w:t>
+      </w:r>
+      <w:proofErr w:type="gramEnd"/>
+      <w:r>
+        <w:rPr>
+          <w:sz w:val="28"/>
+          <w:szCs w:val="28"/>
+        </w:rPr>
+        <w:t>non-accepting)</w:t>
+      </w:r>
+    </w:p>
+    <w:p>
+      <w:pPr>
+        <w:pStyle w:val="NormalWeb"/>
+        <w:ind w:left="720"/>
+        <w:rPr>
+          <w:sz w:val="28"/>
+          <w:szCs w:val="28"/>
+        </w:rPr>
+      </w:pPr>
+      <w:r>
+        <w:rPr>
+          <w:sz w:val="28"/>
+          <w:szCs w:val="28"/>
+        </w:rPr>
+        <w:t xml:space="preserve">S1 = </w:t>
+      </w:r>
+      <w:proofErr w:type="gramStart"/>
+      <w:r>
+        <w:rPr>
+          <w:sz w:val="28"/>
+          <w:szCs w:val="28"/>
+        </w:rPr>
+        <w:t>{ q</w:t>
+      </w:r>
+      <w:proofErr w:type="gramEnd"/>
+      <w:r>
+        <w:rPr>
+          <w:sz w:val="28"/>
+          <w:szCs w:val="28"/>
+        </w:rPr>
+        <w:t>1, q2, q</w:t>
+      </w:r>
+      <w:proofErr w:type="gramStart"/>
+      <w:r>
+        <w:rPr>
+          <w:sz w:val="28"/>
+          <w:szCs w:val="28"/>
+        </w:rPr>
+        <w:t>3 }</w:t>
+      </w:r>
+      <w:proofErr w:type="gramEnd"/>
+      <w:r>
+        <w:rPr>
+          <w:sz w:val="28"/>
+          <w:szCs w:val="28"/>
+        </w:rPr>
+        <w:t xml:space="preserve"> IDENTIFIER (accepting</w:t>
+      </w:r>
+      <w:r>
+        <w:rPr>
+          <w:sz w:val="28"/>
+          <w:szCs w:val="28"/>
+        </w:rPr>
+        <w:t>)</w:t>
+      </w:r>
+      <w:r>
+        <w:rPr>
+          <w:sz w:val="28"/>
+          <w:szCs w:val="28"/>
+        </w:rPr>
+        <w:t xml:space="preserve"> self-loop on </w:t>
+      </w:r>
+      <w:proofErr w:type="spellStart"/>
+      <w:r>
+        <w:rPr>
+          <w:sz w:val="28"/>
+          <w:szCs w:val="28"/>
+        </w:rPr>
+        <w:t>letter|digit</w:t>
+      </w:r>
+      <w:proofErr w:type="spellEnd"/>
+      <w:r>
+        <w:rPr>
+          <w:sz w:val="28"/>
+          <w:szCs w:val="28"/>
+        </w:rPr>
+        <w:t>|_</w:t>
+      </w:r>
+    </w:p>
+    <w:p>
+      <w:pPr>
+        <w:pStyle w:val="NormalWeb"/>
+        <w:ind w:left="720"/>
+        <w:rPr>
+          <w:sz w:val="28"/>
+          <w:szCs w:val="28"/>
+        </w:rPr>
+      </w:pPr>
+      <w:r>
+        <w:rPr>
+          <w:b/>
+          <w:bCs/>
+          <w:sz w:val="28"/>
+          <w:szCs w:val="28"/>
+          <w:u w:val="single"/>
+        </w:rPr>
+        <w:t>Combined DFSM</w:t>
+      </w:r>
+      <w:r>
+        <w:rPr>
+          <w:b/>
+          <w:bCs/>
+          <w:sz w:val="28"/>
+          <w:szCs w:val="28"/>
+          <w:u w:val="single"/>
+        </w:rPr>
+        <w:t>:</w:t>
+      </w:r>
+      <w:r>
+        <w:rPr>
+          <w:sz w:val="28"/>
+          <w:szCs w:val="28"/>
+        </w:rPr>
+        <w:t xml:space="preserve"> </w:t>
+      </w:r>
+      <w:r>
+        <w:rPr>
+          <w:sz w:val="28"/>
+          <w:szCs w:val="28"/>
+        </w:rPr>
+        <w:t>The three machines are merged at a single START state, producing the six-state DFSM encoded in fsm.py. START branches to INTEGER on a digit and to IDENTIFIER on a letter or underscore. DECIMAL_POINT is the non-accepting intermediate state between INTEGER and REAL, corresponding to S2 in the Real derivation above.</w:t>
+      </w:r>
+    </w:p>
+    <w:p>
+      <w:pPr>
+        <w:pStyle w:val="NormalWeb"/>
+        <w:ind w:left="720"/>
+        <w:rPr>
+          <w:sz w:val="28"/>
+          <w:szCs w:val="28"/>
+        </w:rPr>
+      </w:pPr>
+      <w:r>
+        <w:rPr>
+          <w:b/>
+          <w:bCs/>
+          <w:sz w:val="28"/>
+          <w:szCs w:val="28"/>
+          <w:u w:val="single"/>
+        </w:rPr>
         <w:t xml:space="preserve">Data Structures: </w:t>
       </w:r>
       <w:r>
@@ -650,23 +3013,7 @@
           <w:sz w:val="28"/>
           <w:szCs w:val="28"/>
         </w:rPr>
-        <w:t xml:space="preserve">The most important data structure that we </w:t>
-      </w:r>
-      <w:proofErr w:type="gramStart"/>
-      <w:r>
-        <w:rPr>
-          <w:sz w:val="28"/>
-          <w:szCs w:val="28"/>
-        </w:rPr>
-        <w:t>used</w:t>
-      </w:r>
-      <w:proofErr w:type="gramEnd"/>
-      <w:r>
-        <w:rPr>
-          <w:sz w:val="28"/>
-          <w:szCs w:val="28"/>
-        </w:rPr>
-        <w:t xml:space="preserve"> is the </w:t>
+        <w:t xml:space="preserve">The most important data structure that we used is the </w:t>
       </w:r>
       <w:r>
         <w:rPr>
@@ -1647,6 +3994,7 @@
   <w:style w:type="character" w:default="1" w:styleId="DefaultParagraphFont">
     <w:name w:val="Default Paragraph Font"/>
     <w:uiPriority w:val="1"/>
+    <w:semiHidden/>
     <w:unhideWhenUsed/>
   </w:style>
   <w:style w:type="table" w:default="1" w:styleId="TableNormal">
@@ -1726,6 +4074,25 @@
       <w:sz w:val="20"/>
       <w:szCs w:val="20"/>
     </w:rPr>
+  </w:style>
+  <w:style w:type="table" w:styleId="TableGrid">
+    <w:name w:val="Table Grid"/>
+    <w:basedOn w:val="TableNormal"/>
+    <w:uiPriority w:val="59"/>
+    <w:rsid w:val="00237950"/>
+    <w:pPr>
+      <w:spacing w:after="0" w:line="240" w:lineRule="auto"/>
+    </w:pPr>
+    <w:tblPr>
+      <w:tblBorders>
+        <w:top w:val="single" w:sz="4" w:space="0" w:color="auto"/>
+        <w:left w:val="single" w:sz="4" w:space="0" w:color="auto"/>
+        <w:bottom w:val="single" w:sz="4" w:space="0" w:color="auto"/>
+        <w:right w:val="single" w:sz="4" w:space="0" w:color="auto"/>
+        <w:insideH w:val="single" w:sz="4" w:space="0" w:color="auto"/>
+        <w:insideV w:val="single" w:sz="4" w:space="0" w:color="auto"/>
+      </w:tblBorders>
+    </w:tblPr>
   </w:style>
 </w:styles>
 </file>

</xml_diff>